<commit_message>
Risks: replace the UF sensitivity figure with the rate/inflation mix heat map (Figure 26); MR1 text updated from the sensitivity model; consolidated regenerated
Co-Authored-By: Claude Sonnet 5.5 <noreply@anthropic.com>
Claude-Session: https://claude.ai/code/session_0188QZHBkA8n5QL7BtmFakQg
</commit_message>
<xml_diff>
--- a/secciones/riesgos/documento/Mallplaza_Investment_Risks_EN.docx
+++ b/secciones/riesgos/documento/Mallplaza_Investment_Risks_EN.docx
@@ -419,7 +419,7 @@
                 <w:sz w:val="16"/>
                 <w:szCs w:val="16"/>
               </w:rPr>
-              <w:t xml:space="preserve">79% of debt is in UF: a 3% higher UF takes CLP 38,691 million off accounting earnings (Note 26). On the target price, however, the effect is slightly positive: indexed rents add CLP 40.8 per share and the higher UF debt subtracts 17.7, a net +23.1 (+1.1%) (Figure 26). The risk is that weaker consumption prevents passing the UF through to rents: without that pass-through, UF +3% takes 0.9% off the target price. Weaker consumption also slows the new business lines (Appendix [X]). </w:t>
+              <w:t xml:space="preserve">79% of debt is in UF: a 3% higher UF takes CLP 38,691 million off accounting earnings (Note 26). On the target price, however, the effect is small, because indexed rents rise with inflation: a 100 bp rise in the long nominal rate coming entirely from expected inflation takes off only 0.3%; if it came entirely from the real rate, 12.0% (Figure 26). The risk is that weaker consumption prevents passing inflation through to rents: if only 70% of the cash flow were indexed, the effect of inflation would rise to 1.0%. Weaker consumption also slows the new business lines (Appendix [X]). </w:t>
             </w:r>
             <w:r>
               <w:rPr>
@@ -976,7 +976,7 @@
                 <w:sz w:val="11"/>
                 <w:szCs w:val="11"/>
               </w:rPr>
-              <w:t xml:space="preserve">Limits = historical low and high of each driver: Mallplaza earnings releases 4Q23–2Q26 (EBITDA margin, occupancy, same-store rent and sales, visitors) and financial statements (maintenance capex 2024 and LTM 2Q26; appraisal growth range, Note 11). Terminal WACC 10.41% and g 3.0% held constant. Source: Mallplaza; Team analysis.</w:t>
+              <w:t xml:space="preserve">Limits = historical minimum and maximum of each variable (Mallplaza releases 4Q23–2Q26; financial statements for maintenance capex and appraisal, Note 11). WACC 10.41% and g 3.0% constant. Source: Mallplaza; Team analysis.</w:t>
             </w:r>
           </w:p>
           <w:p>
@@ -1085,7 +1085,7 @@
                 <w:sz w:val="14"/>
                 <w:szCs w:val="14"/>
               </w:rPr>
-              <w:t xml:space="preserve">Target price sensitivity to a rise in the UF (CLP per share)</w:t>
+              <w:t xml:space="preserve">Target price by long nominal rate and the share of its rise that comes from inflation (CLP)</w:t>
             </w:r>
           </w:p>
           <w:p>
@@ -1095,7 +1095,7 @@
             <w:r>
               <w:drawing>
                 <wp:inline distT="0" distB="0" distL="0" distR="0">
-                  <wp:extent cx="2257425" cy="1276350"/>
+                  <wp:extent cx="2257425" cy="1514475"/>
                   <wp:effectExtent t="0" r="0" b="0" l="0"/>
                   <wp:docPr id="1" name="" descr="" title=""/>
                   <wp:cNvGraphicFramePr>
@@ -1120,7 +1120,7 @@
                         <pic:spPr bwMode="auto">
                           <a:xfrm>
                             <a:off x="0" y="0"/>
-                            <a:ext cx="2257425" cy="1276350"/>
+                            <a:ext cx="2257425" cy="1514475"/>
                           </a:xfrm>
                           <a:prstGeom prst="rect">
                             <a:avLst/>
@@ -1144,7 +1144,7 @@
                 <w:sz w:val="11"/>
                 <w:szCs w:val="11"/>
               </w:rPr>
-              <w:t xml:space="preserve">UF level shock from 2027E; WACC and g constant. Debt: net UF exposure from Note 26. Earnings: +3% reported; +1% and +2% extrapolated. Source: financial statements Jun-26, Note 26; Team analysis.</w:t>
+              <w:t xml:space="preserve">10-year BCP (base 6.25%, 30-Sep-26); the rise is split between real rate and inflation; 85% of cash flow is indexed to inflation (team assumption). Source: Central Bank of Chile; Team analysis.</w:t>
             </w:r>
           </w:p>
         </w:tc>

</xml_diff>

<commit_message>
Informe final: Resumen de inversión con escenarios, sensibilidades y figuras R1–R3; Riesgos con cifras v4; Typst con tablas y figuras anchas; corrige referencias de anexos y cifras obsoletas (ESG, macro, V7); PDF ES/EN de 20 páginas
Co-Authored-By: Claude Sonnet 5.5 <noreply@anthropic.com>
Claude-Session: https://claude.ai/code/session_0188QZHBkA8n5QL7BtmFakQg
</commit_message>
<xml_diff>
--- a/secciones/riesgos/documento/Mallplaza_Investment_Risks_EN.docx
+++ b/secciones/riesgos/documento/Mallplaza_Investment_Risks_EN.docx
@@ -159,7 +159,7 @@
                 <w:sz w:val="16"/>
                 <w:szCs w:val="16"/>
               </w:rPr>
-              <w:t xml:space="preserve">EBITDA margin, rents, footfall or occupancy falling to their historical lows. The worst case, a 75.8% margin, cuts DCF value to CLP 1,671 (−10.0%), and the historical floor of same-store rent growth takes it to CLP 1,782 (−4.0%) (Figure 24). </w:t>
+              <w:t xml:space="preserve">EBITDA margin, rents, footfall or occupancy falling to their historical lows. The worst case, a 75.8% margin, cuts DCF value to CLP 1,669 (−10.2%), and the historical floor of same-store rent growth takes it to CLP 1,783 (−4.1%) (Figure 24). All levers together, with WACC +100 bp, define the bear scenario (target price CLP 1,542, −56.6% against the share price). </w:t>
             </w:r>
             <w:r>
               <w:rPr>
@@ -233,7 +233,7 @@
                 <w:sz w:val="16"/>
                 <w:szCs w:val="16"/>
               </w:rPr>
-              <w:t xml:space="preserve">Anchors, mostly from the Falabella group, drive footfall. Shrinking or losing them would lower visits and rents from smaller stores. The impact ranges from −1.3% to −4.0% (Figure 24). </w:t>
+              <w:t xml:space="preserve">Anchors, mostly from the Falabella group, drive footfall. Shrinking or losing them would lower visits and rents from smaller stores. The impact ranges from −1.3% to −4.1% (Figure 24). </w:t>
             </w:r>
             <w:r>
               <w:rPr>
@@ -326,7 +326,7 @@
                 <w:sz w:val="16"/>
                 <w:szCs w:val="16"/>
               </w:rPr>
-              <w:t xml:space="preserve">Higher long-term rates would raise the WACC and the cost of refinancing debt and the pipeline. Likelihood is high: the 10Y UST moved from 4.98% (model Rf) to 5.22% on 8-Oct-26, a 24-year high (since 2002); the Fed hiked in September and the Central Bank of Chile reports rising local long-term rates. With WACC +50 bp and +100 bp, the target price falls 6.5% and 12.3% (Figure 25). </w:t>
+              <w:t xml:space="preserve">Higher long-term rates would raise the WACC and the cost of refinancing debt and the pipeline. Likelihood is high: the 10Y UST moved from 4.98% (model Rf) to 5.22% on 8-Oct-26, a 24-year high (since 2002); the Fed hiked in September and the Central Bank of Chile reports rising local long-term rates. With nominal WACC +50 bp and +100 bp, the target price falls 6.7% and 12.5% (Figure 25). </w:t>
             </w:r>
             <w:r>
               <w:rPr>
@@ -419,7 +419,7 @@
                 <w:sz w:val="16"/>
                 <w:szCs w:val="16"/>
               </w:rPr>
-              <w:t xml:space="preserve">79% of debt is in UF: a 3% higher UF takes CLP 38,691 million off accounting earnings (Note 26). On the target price, however, the effect is small, because indexed rents rise with inflation: a 100 bp rise in the long nominal rate coming entirely from expected inflation takes off only 0.3%; if it came entirely from the real rate, 12.0% (Figure 26). The risk is that weaker consumption prevents passing inflation through to rents: if only 70% of the cash flow were indexed, the effect of inflation would rise to 1.0%. Weaker consumption also slows the new business lines (Appendix [X]). </w:t>
+              <w:t xml:space="preserve">79% of debt is in UF: a 3% higher UF takes CLP 38,691 million off accounting earnings (Note 26). On the target price, however, the effect is small, because indexed rents rise with inflation: a 100 bp rise in the long nominal rate coming entirely from expected inflation takes off only 0.3%; if it came entirely from the real rate, 12.2% (Figure 26). The risk is that weaker consumption prevents passing inflation through to rents: if only 70% of the cash flow were indexed, the effect of inflation would rise to 1.0%. Weaker consumption also slows the new business lines (Appendix [X]). </w:t>
             </w:r>
             <w:r>
               <w:rPr>
@@ -660,7 +660,7 @@
                 <w:sz w:val="16"/>
                 <w:szCs w:val="16"/>
               </w:rPr>
-              <w:t xml:space="preserve">Falabella controls 53.05% and leases space through Falabella, Sodimac and Tottus, which creates receivables with related parties. Fernando de Peña, Mallplaza's CEO for decades, has chaired Falabella since March 2026. Off-market contracts would directly affect rents and value. </w:t>
+              <w:t xml:space="preserve">Falabella controls 53.05% and leases space through Falabella, Sodimac and Tottus, which creates receivables with related parties. Fernando de Peña, Mallplaza's CEO for decades, has chaired Falabella since March 2026. Off-market contracts would directly affect rents and value. There is also a capital-allocation risk: expansion earns less than its cost (real RONIC of 5.3% against a real WACC of 7.2%), so continued growth benefits accounting profit and a controller with other businesses in those malls more than the minority shareholder (to be verified; see Valuation). </w:t>
             </w:r>
             <w:r>
               <w:rPr>
@@ -771,7 +771,7 @@
                 <w:sz w:val="16"/>
                 <w:szCs w:val="16"/>
               </w:rPr>
-              <w:t xml:space="preserve">pro-investment agendas. In Chile, Kast signed the Reconstruction Law (9-Oct-26), which gradually cuts corporate tax from 27% to 23% from 2027 (Emol, 9-Oct-26), S&amp;P affirmed its A stable rating and Law 21,770 (Sep-25) shortens permitting. In Peru, the minimum-wage rise to S/ 1,300 and the doubling of Pensión 65 support consumption (Infobae, 28-Jul-26). Colombia contributes only ~11% of revenue. The model keeps 27%: the Chilean cut would add ~3.9% to the target price.</w:t>
+              <w:t xml:space="preserve">pro-investment agendas. In Chile, Kast signed the Reconstruction Law (9-Oct-26), which gradually cuts corporate tax from 27% to 23% from 2027 (Emol, 9-Oct-26), S&amp;P affirmed its A stable rating and Law 21,770 (Sep-25) shortens permitting. In Peru, the minimum-wage rise to S/ 1,300 and the doubling of Pensión 65 support consumption (Infobae, 28-Jul-26). Colombia contributes only ~11% of revenue. The model keeps 27%: the Chilean cut would add ~5.2% to the target price.</w:t>
             </w:r>
           </w:p>
         </w:tc>

</xml_diff>